<commit_message>
All of components completed component files completed can save components
</commit_message>
<xml_diff>
--- a/documentation/project.docx
+++ b/documentation/project.docx
@@ -68,7 +68,9 @@
         </w:tblBorders>
         <w:tblLayout w:type="autofit"/>
         <w:tblCellMar>
+          <w:top w:w="0" w:type="dxa"/>
           <w:left w:w="108" w:type="dxa"/>
+          <w:bottom w:w="0" w:type="dxa"/>
           <w:right w:w="108" w:type="dxa"/>
         </w:tblCellMar>
       </w:tblPr>
@@ -88,7 +90,9 @@
             <w:insideV w:val="single" w:color="auto" w:sz="4" w:space="0"/>
           </w:tblBorders>
           <w:tblCellMar>
+            <w:top w:w="0" w:type="dxa"/>
             <w:left w:w="108" w:type="dxa"/>
+            <w:bottom w:w="0" w:type="dxa"/>
             <w:right w:w="108" w:type="dxa"/>
           </w:tblCellMar>
         </w:tblPrEx>
@@ -98,6 +102,8 @@
           </w:tcPr>
           <w:p>
             <w:pPr>
+              <w:widowControl w:val="0"/>
+              <w:jc w:val="both"/>
               <w:rPr>
                 <w:rFonts w:hint="default"/>
                 <w:vertAlign w:val="baseline"/>
@@ -120,6 +126,8 @@
           </w:tcPr>
           <w:p>
             <w:pPr>
+              <w:widowControl w:val="0"/>
+              <w:jc w:val="both"/>
               <w:rPr>
                 <w:rFonts w:hint="default"/>
                 <w:vertAlign w:val="baseline"/>
@@ -142,6 +150,8 @@
           </w:tcPr>
           <w:p>
             <w:pPr>
+              <w:widowControl w:val="0"/>
+              <w:jc w:val="both"/>
               <w:rPr>
                 <w:rFonts w:hint="default"/>
                 <w:vertAlign w:val="baseline"/>
@@ -170,7 +180,9 @@
             <w:insideV w:val="single" w:color="auto" w:sz="4" w:space="0"/>
           </w:tblBorders>
           <w:tblCellMar>
+            <w:top w:w="0" w:type="dxa"/>
             <w:left w:w="108" w:type="dxa"/>
+            <w:bottom w:w="0" w:type="dxa"/>
             <w:right w:w="108" w:type="dxa"/>
           </w:tblCellMar>
         </w:tblPrEx>
@@ -180,6 +192,8 @@
           </w:tcPr>
           <w:p>
             <w:pPr>
+              <w:widowControl w:val="0"/>
+              <w:jc w:val="both"/>
               <w:rPr>
                 <w:rFonts w:hint="default"/>
                 <w:vertAlign w:val="baseline"/>
@@ -202,6 +216,8 @@
           </w:tcPr>
           <w:p>
             <w:pPr>
+              <w:widowControl w:val="0"/>
+              <w:jc w:val="both"/>
               <w:rPr>
                 <w:rFonts w:hint="default"/>
                 <w:vertAlign w:val="baseline"/>
@@ -219,6 +235,8 @@
           </w:p>
           <w:p>
             <w:pPr>
+              <w:widowControl w:val="0"/>
+              <w:jc w:val="both"/>
               <w:rPr>
                 <w:rFonts w:hint="default"/>
                 <w:vertAlign w:val="baseline"/>
@@ -241,6 +259,8 @@
           </w:tcPr>
           <w:p>
             <w:pPr>
+              <w:widowControl w:val="0"/>
+              <w:jc w:val="both"/>
               <w:rPr>
                 <w:rFonts w:hint="default"/>
                 <w:vertAlign w:val="baseline"/>
@@ -261,7 +281,9 @@
             <w:insideV w:val="single" w:color="auto" w:sz="4" w:space="0"/>
           </w:tblBorders>
           <w:tblCellMar>
+            <w:top w:w="0" w:type="dxa"/>
             <w:left w:w="108" w:type="dxa"/>
+            <w:bottom w:w="0" w:type="dxa"/>
             <w:right w:w="108" w:type="dxa"/>
           </w:tblCellMar>
         </w:tblPrEx>
@@ -271,12 +293,22 @@
           </w:tcPr>
           <w:p>
             <w:pPr>
+              <w:widowControl w:val="0"/>
+              <w:jc w:val="both"/>
               <w:rPr>
                 <w:rFonts w:hint="default"/>
                 <w:vertAlign w:val="baseline"/>
                 <w:lang w:val="en-US"/>
               </w:rPr>
             </w:pPr>
+            <w:r>
+              <w:rPr>
+                <w:rFonts w:hint="default"/>
+                <w:vertAlign w:val="baseline"/>
+                <w:lang w:val="en-US"/>
+              </w:rPr>
+              <w:t>2026.08.12</w:t>
+            </w:r>
           </w:p>
         </w:tc>
         <w:tc>
@@ -285,12 +317,22 @@
           </w:tcPr>
           <w:p>
             <w:pPr>
+              <w:widowControl w:val="0"/>
+              <w:jc w:val="both"/>
               <w:rPr>
                 <w:rFonts w:hint="default"/>
                 <w:vertAlign w:val="baseline"/>
                 <w:lang w:val="en-US"/>
               </w:rPr>
             </w:pPr>
+            <w:r>
+              <w:rPr>
+                <w:rFonts w:hint="default"/>
+                <w:vertAlign w:val="baseline"/>
+                <w:lang w:val="en-US"/>
+              </w:rPr>
+              <w:t>Create files data consumble, driver</w:t>
+            </w:r>
           </w:p>
         </w:tc>
         <w:tc>
@@ -299,6 +341,8 @@
           </w:tcPr>
           <w:p>
             <w:pPr>
+              <w:widowControl w:val="0"/>
+              <w:jc w:val="both"/>
               <w:rPr>
                 <w:rFonts w:hint="default"/>
                 <w:vertAlign w:val="baseline"/>
@@ -316,8 +360,6 @@
           <w:lang w:val="en-US"/>
         </w:rPr>
       </w:pPr>
-      <w:bookmarkStart w:id="0" w:name="_GoBack"/>
-      <w:bookmarkEnd w:id="0"/>
     </w:p>
     <w:sectPr>
       <w:pgSz w:w="11906" w:h="16838"/>
@@ -488,7 +530,7 @@
     <w:lsdException w:unhideWhenUsed="0" w:uiPriority="0" w:semiHidden="0" w:name="Table Web 2"/>
     <w:lsdException w:unhideWhenUsed="0" w:uiPriority="0" w:semiHidden="0" w:name="Table Web 3"/>
     <w:lsdException w:unhideWhenUsed="0" w:uiPriority="0" w:semiHidden="0" w:name="Balloon Text"/>
-    <w:lsdException w:unhideWhenUsed="0" w:uiPriority="0" w:semiHidden="0" w:name="Table Grid"/>
+    <w:lsdException w:qFormat="1" w:unhideWhenUsed="0" w:uiPriority="0" w:semiHidden="0" w:name="Table Grid"/>
     <w:lsdException w:unhideWhenUsed="0" w:uiPriority="0" w:semiHidden="0" w:name="Table Theme"/>
     <w:lsdException w:unhideWhenUsed="0" w:uiPriority="60" w:semiHidden="0" w:name="Light Shading"/>
     <w:lsdException w:unhideWhenUsed="0" w:uiPriority="61" w:semiHidden="0" w:name="Light List"/>
@@ -621,6 +663,7 @@
   <w:style w:type="table" w:styleId="4">
     <w:name w:val="Table Grid"/>
     <w:basedOn w:val="3"/>
+    <w:qFormat/>
     <w:uiPriority w:val="0"/>
     <w:pPr>
       <w:widowControl w:val="0"/>

</xml_diff>